<commit_message>
Documente le code d'accès du RAG interne dans les 3 guides
Ajoute le code d'accès (ZavRYCJ8xyHVY4-jAtUb1Ijz) et son usage dans
le guide utilisateur (134), le guide de formation (accès + liens
utiles), et documente les 2 nouveaux nœuds de vérification d'accès
dans l'annexe technique du guide troubleshooting (135), avec
renumérotation complète du tableau des nœuds du workflow interne.

Co-Authored-By: Claude Sonnet 5 <noreply@anthropic.com>
</commit_message>
<xml_diff>
--- a/docs/transferai-admin/134_Guide_Utilisateur_RAG_Ingestion_Documentaire_2026-07-09.docx
+++ b/docs/transferai-admin/134_Guide_Utilisateur_RAG_Ingestion_Documentaire_2026-07-09.docx
@@ -2835,6 +2835,23 @@
       </w:pPr>
       <w:r>
         <w:t xml:space="preserve">Cette interface ne passe pas par le workflow n8n interne : elle appelle une fonction serveur dédiée (une « Edge Function » Supabase) qui réimplémente directement le même pipeline (embedding, recherche vectorielle, génération de réponse), ce qui la rend plus stable et plus rapide à faire évoluer.</w:t>
+      </w:r>
+    </w:p>
+    <w:p>
+      <w:pPr>
+        <w:pBdr>
+          <w:left w:val="single" w:color="1F6FB2" w:sz="18" w:space="8"/>
+        </w:pBdr>
+        <w:shd w:fill="D9E8F5" w:val="clear"/>
+        <w:spacing w:after="200" w:before="120"/>
+        <w:ind w:left="120"/>
+      </w:pPr>
+      <w:r>
+        <w:rPr>
+          <w:i/>
+          <w:iCs/>
+        </w:rPr>
+        <w:t xml:space="preserve">Accès : www.transferai.ci/demo/recherche-documentaire — un code d’accès est demandé à la première visite (protection ajoutée le 09/07/2026, les documents de prospection contenant de vraies données de contacts). Code d’accès : ZavRYCJ8xyHVY4-jAtUb1Ijz. Ce code est à usage interne uniquement — ne pas le transmettre en dehors de l’équipe TransferAI.</w:t>
       </w:r>
     </w:p>
     <w:p>

</xml_diff>